<commit_message>
Medarbejderregisteret er opdateret så medarbejderlisten kan komme ind i systemet og vedligeholdes her.
</commit_message>
<xml_diff>
--- a/Medarbejder registeret i PS Løn.docx
+++ b/Medarbejder registeret i PS Løn.docx
@@ -20,15 +20,7 @@
     </w:p>
     <w:p>
       <w:r>
-        <w:t xml:space="preserve">Når der oprettes en bruger i dag, tilføjes forskellig information </w:t>
-      </w:r>
-      <w:proofErr w:type="spellStart"/>
-      <w:r>
-        <w:t>ift</w:t>
-      </w:r>
-      <w:proofErr w:type="spellEnd"/>
-      <w:r>
-        <w:t xml:space="preserve"> om det handler om en funktionær eller en chauffør. Nogle ting er påkrævet, andre er ikke.</w:t>
+        <w:t>Når der oprettes en bruger i dag, tilføjes forskellig information ift om det handler om en funktionær eller en chauffør. Nogle ting er påkrævet, andre er ikke.</w:t>
       </w:r>
     </w:p>
     <w:p>
@@ -160,11 +152,9 @@
           <w:numId w:val="1"/>
         </w:numPr>
       </w:pPr>
-      <w:proofErr w:type="spellStart"/>
       <w:r>
         <w:t>Email</w:t>
       </w:r>
-      <w:proofErr w:type="spellEnd"/>
     </w:p>
     <w:p>
       <w:pPr>
@@ -452,11 +442,9 @@
           <w:numId w:val="1"/>
         </w:numPr>
       </w:pPr>
-      <w:proofErr w:type="spellStart"/>
       <w:r>
         <w:t>Email</w:t>
       </w:r>
-      <w:proofErr w:type="spellEnd"/>
     </w:p>
     <w:p>
       <w:pPr>
@@ -807,11 +795,9 @@
           <w:numId w:val="1"/>
         </w:numPr>
       </w:pPr>
-      <w:proofErr w:type="spellStart"/>
       <w:r>
         <w:t>Email</w:t>
       </w:r>
-      <w:proofErr w:type="spellEnd"/>
       <w:r>
         <w:t xml:space="preserve"> </w:t>
       </w:r>
@@ -819,21 +805,7 @@
         <w:rPr>
           <w:color w:val="4EA72E" w:themeColor="accent6"/>
         </w:rPr>
-        <w:t>(</w:t>
-      </w:r>
-      <w:proofErr w:type="spellStart"/>
-      <w:r>
-        <w:rPr>
-          <w:color w:val="4EA72E" w:themeColor="accent6"/>
-        </w:rPr>
-        <w:t>poulschou</w:t>
-      </w:r>
-      <w:proofErr w:type="spellEnd"/>
-      <w:r>
-        <w:rPr>
-          <w:color w:val="4EA72E" w:themeColor="accent6"/>
-        </w:rPr>
-        <w:t>)*</w:t>
+        <w:t>(poulschou)*</w:t>
       </w:r>
     </w:p>
     <w:p>
@@ -1077,23 +1049,7 @@
         <w:ind w:left="360"/>
       </w:pPr>
       <w:r>
-        <w:t xml:space="preserve">For </w:t>
-      </w:r>
-      <w:proofErr w:type="spellStart"/>
-      <w:r>
-        <w:t>Email</w:t>
-      </w:r>
-      <w:proofErr w:type="spellEnd"/>
-      <w:r>
-        <w:t xml:space="preserve"> skal der for funktionærer tilføjes en parentes ”(</w:t>
-      </w:r>
-      <w:proofErr w:type="spellStart"/>
-      <w:r>
-        <w:t>Poulschou</w:t>
-      </w:r>
-      <w:proofErr w:type="spellEnd"/>
-      <w:r>
-        <w:t>)”.</w:t>
+        <w:t>For Email skal der for funktionærer tilføjes en parentes ”(Poulschou)”.</w:t>
       </w:r>
       <w:r>
         <w:t xml:space="preserve"> Samt den gøres påkrævet.</w:t>
@@ -1114,29 +1070,11 @@
       <w:pPr>
         <w:ind w:left="360"/>
       </w:pPr>
-      <w:proofErr w:type="spellStart"/>
-      <w:r>
-        <w:t>CPRnummer</w:t>
-      </w:r>
-      <w:proofErr w:type="spellEnd"/>
-      <w:r>
-        <w:t xml:space="preserve"> er </w:t>
-      </w:r>
-      <w:proofErr w:type="spellStart"/>
-      <w:r>
-        <w:t>førdselsdag</w:t>
-      </w:r>
-      <w:proofErr w:type="spellEnd"/>
-      <w:r>
-        <w:t xml:space="preserve"> efterfulgt af de fire hemmelige i format </w:t>
-      </w:r>
-      <w:proofErr w:type="spellStart"/>
-      <w:r>
-        <w:t>ddmmåå-xxxx</w:t>
-      </w:r>
-      <w:proofErr w:type="spellEnd"/>
-      <w:r>
-        <w:t>.</w:t>
+      <w:r>
+        <w:t>CPRnummer er førdselsdag</w:t>
+      </w:r>
+      <w:r>
+        <w:t xml:space="preserve"> efterfulgt af de fire hemmelige i format ddmmåå-xxxx.</w:t>
       </w:r>
     </w:p>
     <w:p>
@@ -1172,15 +1110,7 @@
         <w:t>, skal der fremadrettet</w:t>
       </w:r>
       <w:r>
-        <w:t xml:space="preserve"> </w:t>
-      </w:r>
-      <w:proofErr w:type="spellStart"/>
-      <w:r>
-        <w:t>fremadrettet</w:t>
-      </w:r>
-      <w:proofErr w:type="spellEnd"/>
-      <w:r>
-        <w:t xml:space="preserve"> kunne udfyldes følgende felter.</w:t>
+        <w:t xml:space="preserve"> fremadrettet kunne udfyldes følgende felter.</w:t>
       </w:r>
       <w:r>
         <w:t xml:space="preserve"> </w:t>
@@ -1344,11 +1274,9 @@
           <w:numId w:val="1"/>
         </w:numPr>
       </w:pPr>
-      <w:proofErr w:type="spellStart"/>
       <w:r>
         <w:t>Email</w:t>
       </w:r>
-      <w:proofErr w:type="spellEnd"/>
       <w:r>
         <w:t xml:space="preserve"> </w:t>
       </w:r>
@@ -1606,15 +1534,7 @@
         <w:ind w:left="360"/>
       </w:pPr>
       <w:r>
-        <w:t xml:space="preserve">For </w:t>
-      </w:r>
-      <w:proofErr w:type="spellStart"/>
-      <w:r>
-        <w:t>Email</w:t>
-      </w:r>
-      <w:proofErr w:type="spellEnd"/>
-      <w:r>
-        <w:t xml:space="preserve"> skal der for funktionærer tilføjes en parentes ”(P</w:t>
+        <w:t>For Email skal der for funktionærer tilføjes en parentes ”(P</w:t>
       </w:r>
       <w:r>
         <w:t>rivat</w:t>
@@ -1639,29 +1559,8 @@
       <w:pPr>
         <w:ind w:left="360"/>
       </w:pPr>
-      <w:proofErr w:type="spellStart"/>
-      <w:r>
-        <w:t>CPRnummer</w:t>
-      </w:r>
-      <w:proofErr w:type="spellEnd"/>
-      <w:r>
-        <w:t xml:space="preserve"> er </w:t>
-      </w:r>
-      <w:proofErr w:type="spellStart"/>
-      <w:r>
-        <w:t>førdselsdag</w:t>
-      </w:r>
-      <w:proofErr w:type="spellEnd"/>
-      <w:r>
-        <w:t xml:space="preserve"> efterfulgt af de fire hemmelige i format </w:t>
-      </w:r>
-      <w:proofErr w:type="spellStart"/>
-      <w:r>
-        <w:t>ddmmåå-xxxx</w:t>
-      </w:r>
-      <w:proofErr w:type="spellEnd"/>
-      <w:r>
-        <w:t>.</w:t>
+      <w:r>
+        <w:t>CPRnummer er førdselsdag efterfulgt af de fire hemmelige i format ddmmåå-xxxx.</w:t>
       </w:r>
     </w:p>
     <w:p>
@@ -1669,15 +1568,7 @@
         <w:ind w:left="360"/>
       </w:pPr>
       <w:r>
-        <w:t>Hvis Elev afkrydses, skal der åbnes for to felter Start/</w:t>
-      </w:r>
-      <w:proofErr w:type="spellStart"/>
-      <w:r>
-        <w:t>sluttdato</w:t>
-      </w:r>
-      <w:proofErr w:type="spellEnd"/>
-      <w:r>
-        <w:t>, som er påkrævet udfyldt. Den skal ikke være afkrydset som default.</w:t>
+        <w:t>Hvis Elev afkrydses, skal der åbnes for to felter Start/sluttdato, som er påkrævet udfyldt. Den skal ikke være afkrydset som default.</w:t>
       </w:r>
     </w:p>
     <w:p>
@@ -1693,15 +1584,7 @@
         <w:ind w:left="360"/>
       </w:pPr>
       <w:r>
-        <w:t xml:space="preserve">Natarbejdetillæg handler om der er udfyldt nogle kontraktmæssige </w:t>
-      </w:r>
-      <w:proofErr w:type="spellStart"/>
-      <w:r>
-        <w:t>papire</w:t>
-      </w:r>
-      <w:proofErr w:type="spellEnd"/>
-      <w:r>
-        <w:t xml:space="preserve">. Det har ikke anden funktion end at det skal være muligt at filtrere listen på. Den skal være ikke afkrydset som default. </w:t>
+        <w:t xml:space="preserve">Natarbejdetillæg handler om der er udfyldt nogle kontraktmæssige papire. Det har ikke anden funktion end at det skal være muligt at filtrere listen på. Den skal være ikke afkrydset som default. </w:t>
       </w:r>
     </w:p>
     <w:p>
@@ -1806,6 +1689,51 @@
       </w:r>
       <w:r>
         <w:t xml:space="preserve">registeret (tabelvisningen). Der skal være en rettighed hertil. </w:t>
+      </w:r>
+    </w:p>
+    <w:p>
+      <w:r>
+        <w:lastRenderedPageBreak/>
+        <w:drawing>
+          <wp:inline distT="0" distB="0" distL="0" distR="0" wp14:anchorId="09E56C20" wp14:editId="4E48EDB5">
+            <wp:extent cx="6120130" cy="1852295"/>
+            <wp:effectExtent l="0" t="0" r="0" b="0"/>
+            <wp:docPr id="810126048" name="Billede 1"/>
+            <wp:cNvGraphicFramePr>
+              <a:graphicFrameLocks xmlns:a="http://schemas.openxmlformats.org/drawingml/2006/main" noChangeAspect="1"/>
+            </wp:cNvGraphicFramePr>
+            <a:graphic xmlns:a="http://schemas.openxmlformats.org/drawingml/2006/main">
+              <a:graphicData uri="http://schemas.openxmlformats.org/drawingml/2006/picture">
+                <pic:pic xmlns:pic="http://schemas.openxmlformats.org/drawingml/2006/picture">
+                  <pic:nvPicPr>
+                    <pic:cNvPr id="810126048" name=""/>
+                    <pic:cNvPicPr/>
+                  </pic:nvPicPr>
+                  <pic:blipFill>
+                    <a:blip r:embed="rId5"/>
+                    <a:stretch>
+                      <a:fillRect/>
+                    </a:stretch>
+                  </pic:blipFill>
+                  <pic:spPr>
+                    <a:xfrm>
+                      <a:off x="0" y="0"/>
+                      <a:ext cx="6120130" cy="1852295"/>
+                    </a:xfrm>
+                    <a:prstGeom prst="rect">
+                      <a:avLst/>
+                    </a:prstGeom>
+                  </pic:spPr>
+                </pic:pic>
+              </a:graphicData>
+            </a:graphic>
+          </wp:inline>
+        </w:drawing>
+      </w:r>
+    </w:p>
+    <w:p>
+      <w:r>
+        <w:t>Under navnet på medarbejdere ved siden af lønnummer skal ”stilling” vises.</w:t>
       </w:r>
     </w:p>
     <w:p/>

</xml_diff>